<commit_message>
Document new /memory & /ref commands in the user guide
- Quick Reference: add 'Layered Memory & Output Offload' subsection
  covering /memory, /ref, memory_status, memory_recall, ref_read
- Update Persistence Layer intro to describe the layered memory engine,
  persona file, and refs/ offload
</commit_message>
<xml_diff>
--- a/GRID_Tools_Test_Guide.docx
+++ b/GRID_Tools_Test_Guide.docx
@@ -829,23 +829,7 @@
         </w:rPr>
       </w:pPr>
       <w:r>
-        <w:rPr>
-          <w:b/>
-        </w:rPr>
-        <w:t>DuckDB</w:t>
-      </w:r>
-      <w:r>
-        <w:t xml:space="preserve">: Local SQL database storing OSINT picdata, tool call logs, scan results, and web cache. Query with </w:t>
-      </w:r>
-      <w:r>
-        <w:rPr>
-          <w:rFonts w:ascii="Consolas" w:hAnsi="Consolas"/>
-          <w:sz w:val="19"/>
-        </w:rPr>
-        <w:t>db_query</w:t>
-      </w:r>
-      <w:r>
-        <w:t>.</w:t>
+        <w:t>Persistence: DuckDB local database stores OSINT picdata, tool call logs, scan results, web cache, AND the layered memory store (atoms / scenarios). Query with db_query. GRID also maintains a persona (grid_persona.md) and offloads verbose tool output to refs/ for token-efficient recall.</w:t>
       </w:r>
     </w:p>
     <w:p>
@@ -9552,6 +9536,76 @@
           <w:sz w:val="20"/>
         </w:rPr>
         <w:t>pb_upload C:\path\to\file.png</w:t>
+      </w:r>
+    </w:p>
+    <w:p>
+      <w:pPr>
+        <w:pStyle w:val="Heading2"/>
+      </w:pPr>
+      <w:r>
+        <w:t>Layered Memory &amp; Output Offload</w:t>
+      </w:r>
+    </w:p>
+    <w:p>
+      <w:pPr/>
+      <w:r>
+        <w:t>GRID remembers across sessions via a layered memory engine (persona -&gt; scenarios -&gt; facts -&gt; raw transcript), distilled automatically every 5 turns and recalled by relevance. Verbose tool output is offloaded to disk; pull it back any time by ref id.</w:t>
+      </w:r>
+    </w:p>
+    <w:p>
+      <w:pPr>
+        <w:pStyle w:val="ListBullet"/>
+      </w:pPr>
+      <w:r>
+        <w:t>/memory -- Show memory stats (atoms, scenarios, refs, persona size)</w:t>
+      </w:r>
+    </w:p>
+    <w:p>
+      <w:pPr>
+        <w:pStyle w:val="ListBullet"/>
+      </w:pPr>
+      <w:r>
+        <w:t>/memory &lt;query&gt; -- Recall memories relevant to a query</w:t>
+      </w:r>
+    </w:p>
+    <w:p>
+      <w:pPr>
+        <w:pStyle w:val="ListBullet"/>
+      </w:pPr>
+      <w:r>
+        <w:t>/memory clear -- Reset the layered memory store (persona untouched)</w:t>
+      </w:r>
+    </w:p>
+    <w:p>
+      <w:pPr>
+        <w:pStyle w:val="ListBullet"/>
+      </w:pPr>
+      <w:r>
+        <w:t>/ref &lt;id&gt; -- Read a full offloaded tool output saved to disk</w:t>
+      </w:r>
+    </w:p>
+    <w:p>
+      <w:pPr>
+        <w:pStyle w:val="ListBullet"/>
+      </w:pPr>
+      <w:r>
+        <w:t>memory_status -- Tool: show memory layer health</w:t>
+      </w:r>
+    </w:p>
+    <w:p>
+      <w:pPr>
+        <w:pStyle w:val="ListBullet"/>
+      </w:pPr>
+      <w:r>
+        <w:t>memory_recall &lt;query&gt; -- Tool: search layered memory for relevant context</w:t>
+      </w:r>
+    </w:p>
+    <w:p>
+      <w:pPr>
+        <w:pStyle w:val="ListBullet"/>
+      </w:pPr>
+      <w:r>
+        <w:t>ref_read &lt;id&gt; -- Tool: pull an offloaded ref by id</w:t>
       </w:r>
     </w:p>
     <w:p>

</xml_diff>

<commit_message>
Update user manual: 70+ tools / 18 capability groups, add CTF & Game Worlds sections, TOC renumbering, new quick-ref commands
</commit_message>
<xml_diff>
--- a/GRID_Tools_Test_Guide.docx
+++ b/GRID_Tools_Test_Guide.docx
@@ -117,7 +117,7 @@
           <w:color w:val="555555"/>
           <w:sz w:val="22"/>
         </w:rPr>
-        <w:t>59 Integrated Tools - Windows Native</w:t>
+        <w:t>70+ Integrated Tools - Windows Native</w:t>
       </w:r>
     </w:p>
     <w:p>
@@ -478,6 +478,8 @@
         <w:t>19. OSINT Intelligence  — Deep intelligence on domains, IPs, emails, phones, usernames, flight tracking</w:t>
       </w:r>
     </w:p>
+    <w:p/>
+    <w:p/>
     <w:p>
       <w:r>
         <w:t>20. Nmap Scan Variants  — Ready-to-use Nmap flag presets for common scenarios</w:t>
@@ -485,12 +487,22 @@
     </w:p>
     <w:p>
       <w:r>
-        <w:t>21. Quick Reference  — Copy-paste command examples for every module</w:t>
-      </w:r>
-    </w:p>
-    <w:p>
-      <w:r>
-        <w:t>22. Skills  — Dynamic skill creation, tool building, and automation</w:t>
+        <w:t>21.  CTF Sandbox  — Offline local Capture-The-Flag practice range</w:t>
+      </w:r>
+    </w:p>
+    <w:p>
+      <w:r>
+        <w:t>22.  Game Worlds  — GRAD open-world explorer + MiniGrid RL bridge</w:t>
+      </w:r>
+    </w:p>
+    <w:p>
+      <w:r>
+        <w:t>23. Quick Reference  — Copy-paste command examples for every module</w:t>
+      </w:r>
+    </w:p>
+    <w:p>
+      <w:r>
+        <w:t>24. Skills  — Dynamic skill creation, tool building, and automation</w:t>
       </w:r>
     </w:p>
     <w:p>
@@ -532,20 +544,15 @@
         <w:rPr>
           <w:b/>
         </w:rPr>
-        <w:t xml:space="preserve">GRID (General Reconnaissance &amp; Intelligence Dashboard) </w:t>
-      </w:r>
-      <w:r>
-        <w:t xml:space="preserve">is an all-in-one command-line intelligence and automation platform. It brings together </w:t>
-      </w:r>
+        <w:t>GRID (General Reconnaissance &amp; Intelligence Dashboard) is an all-in-one command-line intelligence and automation platform. It brings together 70+ tools across 18 capability groups, all accessible through a single chat-like interface. Whether you need to gather OSINT on a target, scan a network, transfer files over TCP, search the web, or control your mouse and keyboard — GRID handles it.</w:t>
+      </w:r>
+      <w:r/>
       <w:r>
         <w:rPr>
           <w:b/>
         </w:rPr>
-        <w:t>59 tools</w:t>
-      </w:r>
-      <w:r>
-        <w:t xml:space="preserve"> across 15 categories, all accessible through a single chat-like interface. Whether you need to gather OSINT on a target, scan a network, transfer files over TCP, search the web, or control your mouse and keyboard — GRID handles it.</w:t>
-      </w:r>
+      </w:r>
+      <w:r/>
     </w:p>
     <w:p>
       <w:pPr>
@@ -793,6 +800,70 @@
           <w:sz w:val="22"/>
         </w:rPr>
         <w:t>Camera OSINT: Search for open webcams, CCTV, IP cameras, and livestreams by country. Scrapes Insecam, Shodan, and web searches for direct camera IPs and stream URLs. Enriched with dork queries for deeper discovery.</w:t>
+      </w:r>
+    </w:p>
+    <w:p>
+      <w:pPr>
+        <w:pStyle w:val="ListBullet"/>
+      </w:pPr>
+      <w:r>
+        <w:t>Ham Radio &amp; SDR: Discover and stream stations from Radio-Browser.info, connect to public KiwiSDR nodes (open Web UI, stream audio over WebSocket), or tune a local RTL-SDR dongle — all from one interface.</w:t>
+      </w:r>
+    </w:p>
+    <w:p>
+      <w:pPr>
+        <w:pStyle w:val="ListBullet"/>
+      </w:pPr>
+      <w:r>
+        <w:t>Satellite Tracking: Real-time ISS position/velocity/crew, sky position for any NORAD ID, pass predictions from your lat/lon, TLE sets, catalog search, and orbital analysis — no API keys required.</w:t>
+      </w:r>
+    </w:p>
+    <w:p>
+      <w:pPr>
+        <w:pStyle w:val="ListBullet"/>
+      </w:pPr>
+      <w:r>
+        <w:t>Microcontroller &amp; IoT: Connect to ESP32/Arduino/LoRa boards over serial (USB) or WiFi TCP, send plain-English commands, read sensor data, monitor output, and exchange LoRa radio messages.</w:t>
+      </w:r>
+    </w:p>
+    <w:p>
+      <w:pPr>
+        <w:pStyle w:val="ListBullet"/>
+      </w:pPr>
+      <w:r>
+        <w:t>Computer Vision: OpenCV analysis of images/videos — OCR, face detection, QR/barcode decode, camera-stream validation, face comparison, and video forensics with keyframe OCR.</w:t>
+      </w:r>
+    </w:p>
+    <w:p>
+      <w:pPr>
+        <w:pStyle w:val="ListBullet"/>
+      </w:pPr>
+      <w:r>
+        <w:t>CTF Sandbox: Offline local Capture-The-Flag range (SQL injection, Python env-var jail, hidden base64, ROT13 cipher, port banner) — start, hint, submit, score, reset. Fully isolated under ./ctf_range/.</w:t>
+      </w:r>
+    </w:p>
+    <w:p>
+      <w:pPr>
+        <w:pStyle w:val="ListBullet"/>
+      </w:pPr>
+      <w:r>
+        <w:t>Game Worlds: Playable environments — a procedural open-world explorer (move, gather, hunt, reach the Signal Cache) plus a Gymnasium MiniGrid RL benchmark bridge. State persists per game.</w:t>
+      </w:r>
+    </w:p>
+    <w:p>
+      <w:pPr>
+        <w:pStyle w:val="ListBullet"/>
+      </w:pPr>
+      <w:r>
+        <w:t>Google Calendar &amp; Sheets: Create/read/edit Google Calendar events and Google Sheets / Excel workbooks, plus stats/plotlibs on spreadsheet data.</w:t>
+      </w:r>
+    </w:p>
+    <w:p>
+      <w:pPr>
+        <w:pStyle w:val="ListBullet"/>
+      </w:pPr>
+      <w:r>
+        <w:t>Webcam &amp; Ghostcam: Search for public/web/open CCTV streams by location or device, and optionally launch the local ghostcam-finder (omnieye) web UI on localhost.</w:t>
       </w:r>
     </w:p>
     <w:p>
@@ -8891,12 +8962,226 @@
         <w:pStyle w:val="Heading1"/>
       </w:pPr>
       <w:r>
-        <w:t>21. Quick Reference</w:t>
-      </w:r>
-    </w:p>
-    <w:p>
-      <w:r>
-        <w:t>22. Skills</w:t>
+        <w:t>21. CTF Sandbox</w:t>
+      </w:r>
+    </w:p>
+    <w:p>
+      <w:pPr/>
+      <w:r>
+        <w:t>The CTF module opens an offline Capture-The-Flag practice range on your own machine — no network egress, safe for autonomous play. GRID spawns isolated vulnerable challenges (SQL injection, Python env-var jail, hidden base64, ROT13 cipher, port banner) under ./ctf_range/, then solves them with its own tools (db_query, run_code, read_file, nc) and distills the exploit knowledge into layered memory.</w:t>
+      </w:r>
+    </w:p>
+    <w:p>
+      <w:pPr/>
+      <w:r>
+        <w:t>Commands:</w:t>
+      </w:r>
+    </w:p>
+    <w:p>
+      <w:pPr/>
+      <w:r>
+        <w:t>ctf start                                 Spawn a challenge (sql_injection | python_env | hidden_base64 | cipher_rot13 | port_banner)</w:t>
+      </w:r>
+    </w:p>
+    <w:p>
+      <w:pPr/>
+      <w:r>
+        <w:t>ctf status                                Show the active challenge</w:t>
+      </w:r>
+    </w:p>
+    <w:p>
+      <w:pPr/>
+      <w:r>
+        <w:t>ctf hint                                  Ask for a hint</w:t>
+      </w:r>
+    </w:p>
+    <w:p>
+      <w:pPr/>
+      <w:r>
+        <w:t>ctf submit GRID_CTF{...}                  Submit a solved flag</w:t>
+      </w:r>
+    </w:p>
+    <w:p>
+      <w:pPr/>
+      <w:r>
+        <w:t>ctf score                                 View the scoreboard</w:t>
+      </w:r>
+    </w:p>
+    <w:p>
+      <w:pPr/>
+      <w:r>
+        <w:t>ctf reset                                 Clear artifacts and start fresh</w:t>
+      </w:r>
+    </w:p>
+    <w:p>
+      <w:pPr/>
+      <w:r>
+        <w:t>ctf list                                  List available challenges</w:t>
+      </w:r>
+    </w:p>
+    <w:p>
+      <w:pPr/>
+      <w:r>
+        <w:t>Examples:  "ctf start",  "ctf start sql_injection",  "ctf submit GRID_CTF{flag}",  "ctf score"</w:t>
+      </w:r>
+    </w:p>
+    <w:p>
+      <w:pPr/>
+      <w:r/>
+    </w:p>
+    <w:p>
+      <w:pPr>
+        <w:pStyle w:val="Heading1"/>
+      </w:pPr>
+      <w:r>
+        <w:t>22. Game Worlds — GRAD Open-World &amp; MiniGrid</w:t>
+      </w:r>
+    </w:p>
+    <w:p>
+      <w:pPr/>
+      <w:r>
+        <w:t>The game module gives GRID two playable environments.</w:t>
+      </w:r>
+    </w:p>
+    <w:p>
+      <w:pPr/>
+      <w:r>
+        <w:t>WORLD mode is a self-contained open-world sandbox: a procedurally-generated map with terrain (grass/forest/water/ruin), scattered items (water, rations, iron key, compass) and wandering monsters. GRID moves, gathers, hunts, fights, and wins by reaching the Signal Cache tile (C). State persists under ./game_state/world.json so play can span many turns.</w:t>
+      </w:r>
+    </w:p>
+    <w:p>
+      <w:pPr/>
+      <w:r>
+        <w:t>WORLD commands:</w:t>
+      </w:r>
+    </w:p>
+    <w:p>
+      <w:pPr/>
+      <w:r>
+        <w:t>game world map                            View the map (fog of war)</w:t>
+      </w:r>
+    </w:p>
+    <w:p>
+      <w:pPr/>
+      <w:r>
+        <w:t>game world look                           Inspect the current tile</w:t>
+      </w:r>
+    </w:p>
+    <w:p>
+      <w:pPr/>
+      <w:r>
+        <w:t>game world status                         Show energy/health/inventory</w:t>
+      </w:r>
+    </w:p>
+    <w:p>
+      <w:pPr/>
+      <w:r>
+        <w:t>game world move &lt;north|south|east|west&gt;   Move one tile</w:t>
+      </w:r>
+    </w:p>
+    <w:p>
+      <w:pPr/>
+      <w:r>
+        <w:t>game world take                           Pick up an item on the tile</w:t>
+      </w:r>
+    </w:p>
+    <w:p>
+      <w:pPr/>
+      <w:r>
+        <w:t>game world inventory                      List carried items</w:t>
+      </w:r>
+    </w:p>
+    <w:p>
+      <w:pPr/>
+      <w:r>
+        <w:t>game world attack                         Fight a monster on the tile</w:t>
+      </w:r>
+    </w:p>
+    <w:p>
+      <w:pPr/>
+      <w:r>
+        <w:t>game world hunt                           Hunt for a nearby monster</w:t>
+      </w:r>
+    </w:p>
+    <w:p>
+      <w:pPr/>
+      <w:r>
+        <w:t>game world use &lt;item&gt;                     Use a carried item</w:t>
+      </w:r>
+    </w:p>
+    <w:p>
+      <w:pPr/>
+      <w:r>
+        <w:t>game world rest                           Recover energy</w:t>
+      </w:r>
+    </w:p>
+    <w:p>
+      <w:pPr/>
+      <w:r>
+        <w:t>game world new                            Generate a fresh world</w:t>
+      </w:r>
+    </w:p>
+    <w:p>
+      <w:pPr/>
+      <w:r/>
+    </w:p>
+    <w:p>
+      <w:pPr/>
+      <w:r>
+        <w:t>MINIGRID mode bridges Gymnasium MiniGrid RL benchmark environments (requires "pip install gymnasium minigrid"):</w:t>
+      </w:r>
+    </w:p>
+    <w:p>
+      <w:pPr/>
+      <w:r>
+        <w:t>game minigrid status                        Show MiniGrid status</w:t>
+      </w:r>
+    </w:p>
+    <w:p>
+      <w:pPr/>
+      <w:r>
+        <w:t>game minigrid envlist                       List available environments</w:t>
+      </w:r>
+    </w:p>
+    <w:p>
+      <w:pPr/>
+      <w:r>
+        <w:t>game minigrid start &lt;env&gt;                  Start an environment (e.g. MiniGrid-Empty-8x8-v0)</w:t>
+      </w:r>
+    </w:p>
+    <w:p>
+      <w:pPr/>
+      <w:r>
+        <w:t>game minigrid step &lt;action&gt;                Take an action (e.g. "step forward")</w:t>
+      </w:r>
+    </w:p>
+    <w:p>
+      <w:pPr/>
+      <w:r>
+        <w:t>game minigrid reset                        Reset the environment</w:t>
+      </w:r>
+    </w:p>
+    <w:p>
+      <w:pPr/>
+      <w:r>
+        <w:t>Examples:  "game world map",  "game world move north",  "game minigrid start MiniGrid-Empty-8x8-v0"</w:t>
+      </w:r>
+    </w:p>
+    <w:p>
+      <w:pPr/>
+      <w:r/>
+    </w:p>
+    <w:p>
+      <w:pPr>
+        <w:pStyle w:val="Heading1"/>
+      </w:pPr>
+      <w:r>
+        <w:t>23. Quick Reference</w:t>
+      </w:r>
+    </w:p>
+    <w:p>
+      <w:r>
+        <w:t>24. Skills</w:t>
       </w:r>
     </w:p>
     <w:p>
@@ -9723,6 +10008,126 @@
     </w:p>
     <w:p>
       <w:pPr>
+        <w:pStyle w:val="Heading2"/>
+      </w:pPr>
+      <w:r>
+        <w:t>CTF Sandbox</w:t>
+      </w:r>
+    </w:p>
+    <w:p>
+      <w:pPr/>
+      <w:r>
+        <w:t>ctf start</w:t>
+      </w:r>
+    </w:p>
+    <w:p>
+      <w:pPr/>
+      <w:r>
+        <w:t>ctf start sql_injection</w:t>
+      </w:r>
+    </w:p>
+    <w:p>
+      <w:pPr/>
+      <w:r>
+        <w:t>ctf hint</w:t>
+      </w:r>
+    </w:p>
+    <w:p>
+      <w:pPr/>
+      <w:r>
+        <w:t>ctf submit GRID_CTF{flag}</w:t>
+      </w:r>
+    </w:p>
+    <w:p>
+      <w:pPr/>
+      <w:r>
+        <w:t>ctf score</w:t>
+      </w:r>
+    </w:p>
+    <w:p>
+      <w:pPr/>
+      <w:r>
+        <w:t>ctf reset</w:t>
+      </w:r>
+    </w:p>
+    <w:p>
+      <w:pPr>
+        <w:pStyle w:val="Heading2"/>
+      </w:pPr>
+      <w:r>
+        <w:t>Game Worlds &amp; MiniGrid</w:t>
+      </w:r>
+    </w:p>
+    <w:p>
+      <w:pPr/>
+      <w:r>
+        <w:t>game world map</w:t>
+      </w:r>
+    </w:p>
+    <w:p>
+      <w:pPr/>
+      <w:r>
+        <w:t>game world move north</w:t>
+      </w:r>
+    </w:p>
+    <w:p>
+      <w:pPr/>
+      <w:r>
+        <w:t>game world attack</w:t>
+      </w:r>
+    </w:p>
+    <w:p>
+      <w:pPr/>
+      <w:r>
+        <w:t>game minigrid start MiniGrid-Empty-8x8-v0</w:t>
+      </w:r>
+    </w:p>
+    <w:p>
+      <w:pPr/>
+      <w:r>
+        <w:t>game minigrid step forward</w:t>
+      </w:r>
+    </w:p>
+    <w:p>
+      <w:pPr>
+        <w:pStyle w:val="Heading2"/>
+      </w:pPr>
+      <w:r>
+        <w:t>Google &amp; Webcam</w:t>
+      </w:r>
+    </w:p>
+    <w:p>
+      <w:pPr/>
+      <w:r>
+        <w:t>gcal events</w:t>
+      </w:r>
+    </w:p>
+    <w:p>
+      <w:pPr/>
+      <w:r>
+        <w:t>gsheet stats data.xlsx</w:t>
+      </w:r>
+    </w:p>
+    <w:p>
+      <w:pPr/>
+      <w:r>
+        <w:t>gsheet open budget.xlsx</w:t>
+      </w:r>
+    </w:p>
+    <w:p>
+      <w:pPr/>
+      <w:r>
+        <w:t>webcam Japan</w:t>
+      </w:r>
+    </w:p>
+    <w:p>
+      <w:pPr/>
+      <w:r>
+        <w:t>ghostcam start</w:t>
+      </w:r>
+    </w:p>
+    <w:p>
+      <w:pPr>
         <w:spacing w:before="20" w:after="40"/>
         <w:rPr>
           <w:rFonts w:hint="eastAsia"/>
@@ -9779,7 +10184,7 @@
           <w:color w:val="AAAABB"/>
           <w:sz w:val="18"/>
         </w:rPr>
-        <w:t>GRID v2  •  Generated from grid_agent.py tool registry  •  All 59 tools documented</w:t>
+        <w:t>GRID v2  •  Generated from grid_agent.py tool registry  •  All 70 tools documented</w:t>
       </w:r>
     </w:p>
     <w:p>

</xml_diff>